<commit_message>
GUIDES-T41-T45: keep Book Issue discovery wording neutral [skip guides]
</commit_message>
<xml_diff>
--- a/Documents/Student-Guides/Book-Issue/T44_Cancel_Book_Issue/T44_02_Progressive_Development_Guide.docx
+++ b/Documents/Student-Guides/Book-Issue/T44_Cancel_Book_Issue/T44_02_Progressive_Development_Guide.docx
@@ -1066,13 +1066,7 @@
           </w:tcPr>
           <w:p>
             <w:r>
-              <w:rPr>
-                <w:b/>
-              </w:rPr>
-              <w:t xml:space="preserve">Important: </w:t>
-            </w:r>
-            <w:r>
-              <w:t>ISS-0005 is a controlled intermediate workflow state: the Return is already persisted while the Issue status update is still pending. The dependency guard prevents cancellation after a Return exists.</w:t>
+              <w:t>Important: ISS-0005 shows an intermediate workflow state: the Return is already persisted while the Issue status update is still pending. The dependency guard prevents cancellation after a Return exists.</w:t>
             </w:r>
           </w:p>
         </w:tc>

</xml_diff>